<commit_message>
2024-04-05 - 1 Laatste klantaanpassingen
</commit_message>
<xml_diff>
--- a/Coffee3 Extension/src/Reports/Rep50006/Rep50006.ServiceOrderCS.docx
+++ b/Coffee3 Extension/src/Reports/Rep50006/Rep50006.ServiceOrderCS.docx
@@ -20,10 +20,7 @@
     </w:p>
     <w:p>
       <w:pPr>
-        <w:rPr>
-          <w:rFonts w:eastAsiaTheme="minorEastAsia" w:cs="Times New Roman"/>
-          <w:lang w:eastAsia="nl-NL"/>
-        </w:rPr>
+        <w:pStyle w:val="Tekstzonderopmaak"/>
       </w:pPr>
       <w:r>
         <w:rPr>
@@ -61,6 +58,32 @@
         </w:rPr>
         <w:br/>
       </w:r>
+      <w:r>
+        <w:rPr>
+          <w:rFonts w:eastAsiaTheme="minorEastAsia" w:cs="Times New Roman"/>
+          <w:lang w:eastAsia="nl-NL"/>
+        </w:rPr>
+        <w:br/>
+      </w:r>
+      <w:r>
+        <w:t xml:space="preserve">Indien u vragen heeft kunt u ons bereiken via </w:t>
+      </w:r>
+      <w:hyperlink r:id="rId7" w:history="1">
+        <w:r>
+          <w:rPr>
+            <w:rStyle w:val="Hyperlink"/>
+          </w:rPr>
+          <w:t>info@coffee3.nl</w:t>
+        </w:r>
+      </w:hyperlink>
+    </w:p>
+    <w:p>
+      <w:pPr>
+        <w:rPr>
+          <w:rFonts w:eastAsiaTheme="minorEastAsia" w:cs="Times New Roman"/>
+          <w:lang w:eastAsia="nl-NL"/>
+        </w:rPr>
+      </w:pPr>
       <w:r>
         <w:rPr>
           <w:rFonts w:eastAsiaTheme="minorEastAsia" w:cs="Times New Roman"/>
@@ -538,6 +561,46 @@
     <w:uiPriority w:val="99"/>
     <w:semiHidden/>
     <w:unhideWhenUsed/>
+  </w:style>
+  <w:style w:type="character" w:styleId="Hyperlink">
+    <w:name w:val="Hyperlink"/>
+    <w:basedOn w:val="Standaardalinea-lettertype"/>
+    <w:uiPriority w:val="99"/>
+    <w:semiHidden/>
+    <w:unhideWhenUsed/>
+    <w:rsid w:val="00C80B46"/>
+    <w:rPr>
+      <w:color w:val="467886"/>
+      <w:u w:val="single"/>
+    </w:rPr>
+  </w:style>
+  <w:style w:type="paragraph" w:styleId="Tekstzonderopmaak">
+    <w:name w:val="Plain Text"/>
+    <w:basedOn w:val="Standaard"/>
+    <w:link w:val="TekstzonderopmaakChar"/>
+    <w:uiPriority w:val="99"/>
+    <w:semiHidden/>
+    <w:unhideWhenUsed/>
+    <w:rsid w:val="00C80B46"/>
+    <w:pPr>
+      <w:spacing w:after="0" w:line="240" w:lineRule="auto"/>
+    </w:pPr>
+    <w:rPr>
+      <w:rFonts w:ascii="Calibri" w:eastAsia="MS PGothic" w:hAnsi="Calibri" w:cs="Calibri"/>
+      <w14:ligatures w14:val="standardContextual"/>
+    </w:rPr>
+  </w:style>
+  <w:style w:type="character" w:customStyle="1" w:styleId="TekstzonderopmaakChar">
+    <w:name w:val="Tekst zonder opmaak Char"/>
+    <w:basedOn w:val="Standaardalinea-lettertype"/>
+    <w:link w:val="Tekstzonderopmaak"/>
+    <w:uiPriority w:val="99"/>
+    <w:semiHidden/>
+    <w:rsid w:val="00C80B46"/>
+    <w:rPr>
+      <w:rFonts w:ascii="Calibri" w:eastAsia="MS PGothic" w:hAnsi="Calibri" w:cs="Calibri"/>
+      <w14:ligatures w14:val="standardContextual"/>
+    </w:rPr>
   </w:style>
 </w:styles>
 </file>
@@ -1033,18 +1096,18 @@
 </file>
 
 <file path=customXml/item2.xml><?xml version="1.0" encoding="utf-8"?>
-<p:properties xmlns:p="http://schemas.microsoft.com/office/2006/metadata/properties" xmlns:xsi="http://www.w3.org/2001/XMLSchema-instance" xmlns:pc="http://schemas.microsoft.com/office/infopath/2007/PartnerControls">
-  <documentManagement/>
-</p:properties>
-</file>
-
-<file path=customXml/item3.xml><?xml version="1.0" encoding="utf-8"?>
 <?mso-contentType ?>
 <FormTemplates xmlns="http://schemas.microsoft.com/sharepoint/v3/contenttype/forms">
   <Display>DocumentLibraryForm</Display>
   <Edit>DocumentLibraryForm</Edit>
   <New>DocumentLibraryForm</New>
 </FormTemplates>
+</file>
+
+<file path=customXml/item3.xml><?xml version="1.0" encoding="utf-8"?>
+<p:properties xmlns:p="http://schemas.microsoft.com/office/2006/metadata/properties" xmlns:xsi="http://www.w3.org/2001/XMLSchema-instance" xmlns:pc="http://schemas.microsoft.com/office/infopath/2007/PartnerControls">
+  <documentManagement/>
+</p:properties>
 </file>
 
 <file path=customXml/itemProps1.xml><?xml version="1.0" encoding="utf-8"?>
@@ -1067,18 +1130,18 @@
 </file>
 
 <file path=customXml/itemProps2.xml><?xml version="1.0" encoding="utf-8"?>
+<ds:datastoreItem xmlns:ds="http://schemas.openxmlformats.org/officeDocument/2006/customXml" ds:itemID="{922D293B-F4AB-4BB7-AC0F-384A708E6DA1}">
+  <ds:schemaRefs>
+    <ds:schemaRef ds:uri="http://schemas.microsoft.com/sharepoint/v3/contenttype/forms"/>
+  </ds:schemaRefs>
+</ds:datastoreItem>
+</file>
+
+<file path=customXml/itemProps3.xml><?xml version="1.0" encoding="utf-8"?>
 <ds:datastoreItem xmlns:ds="http://schemas.openxmlformats.org/officeDocument/2006/customXml" ds:itemID="{958868CE-B08A-4463-A8A1-58AE1C4963A9}">
   <ds:schemaRefs>
     <ds:schemaRef ds:uri="http://schemas.microsoft.com/office/2006/metadata/properties"/>
     <ds:schemaRef ds:uri="http://schemas.microsoft.com/office/infopath/2007/PartnerControls"/>
   </ds:schemaRefs>
 </ds:datastoreItem>
-</file>
-
-<file path=customXml/itemProps3.xml><?xml version="1.0" encoding="utf-8"?>
-<ds:datastoreItem xmlns:ds="http://schemas.openxmlformats.org/officeDocument/2006/customXml" ds:itemID="{922D293B-F4AB-4BB7-AC0F-384A708E6DA1}">
-  <ds:schemaRefs>
-    <ds:schemaRef ds:uri="http://schemas.microsoft.com/sharepoint/v3/contenttype/forms"/>
-  </ds:schemaRefs>
-</ds:datastoreItem>
 </file>
</xml_diff>